<commit_message>
Last version before upload. Some things needs to be be corrected in the documentations.
</commit_message>
<xml_diff>
--- a/etc/documentation/User_Manual.docx
+++ b/etc/documentation/User_Manual.docx
@@ -12,7 +12,6 @@
           <w:szCs w:val="72"/>
         </w:rPr>
       </w:pPr>
-      <w:proofErr w:type="spellStart"/>
       <w:r>
         <w:rPr>
           <w:rFonts w:asciiTheme="majorHAnsi" w:eastAsia="Times New Roman" w:hAnsiTheme="majorHAnsi"/>
@@ -21,25 +20,14 @@
         </w:rPr>
         <w:t>RetroBattle</w:t>
       </w:r>
-      <w:proofErr w:type="spellEnd"/>
       <w:r>
         <w:rPr>
           <w:rFonts w:asciiTheme="majorHAnsi" w:eastAsia="Times New Roman" w:hAnsiTheme="majorHAnsi"/>
           <w:sz w:val="72"/>
           <w:szCs w:val="72"/>
         </w:rPr>
-        <w:t xml:space="preserve"> </w:t>
-      </w:r>
-      <w:proofErr w:type="spellStart"/>
-      <w:r>
-        <w:rPr>
-          <w:rFonts w:asciiTheme="majorHAnsi" w:eastAsia="Times New Roman" w:hAnsiTheme="majorHAnsi"/>
-          <w:sz w:val="72"/>
-          <w:szCs w:val="72"/>
-        </w:rPr>
-        <w:t>Spielanleitung</w:t>
-      </w:r>
-      <w:proofErr w:type="spellEnd"/>
+        <w:t xml:space="preserve"> Spielanleitung</w:t>
+      </w:r>
     </w:p>
     <w:p>
       <w:pPr>
@@ -59,7 +47,25 @@
           <w:sz w:val="44"/>
           <w:szCs w:val="44"/>
         </w:rPr>
-        <w:t>Version 1.0.0</w:t>
+        <w:t xml:space="preserve">Version </w:t>
+      </w:r>
+      <w:r>
+        <w:rPr>
+          <w:rFonts w:ascii="Times New Roman" w:eastAsia="Times New Roman" w:hAnsi="Times New Roman"/>
+          <w:bCs/>
+          <w:sz w:val="44"/>
+          <w:szCs w:val="44"/>
+        </w:rPr>
+        <w:t>7</w:t>
+      </w:r>
+      <w:r>
+        <w:rPr>
+          <w:rFonts w:ascii="Times New Roman" w:eastAsia="Times New Roman" w:hAnsi="Times New Roman"/>
+          <w:bCs/>
+          <w:sz w:val="44"/>
+          <w:szCs w:val="44"/>
+        </w:rPr>
+        <w:t>.0.0</w:t>
       </w:r>
     </w:p>
     <w:p>
@@ -266,9 +272,8 @@
           <w:sz w:val="32"/>
           <w:szCs w:val="32"/>
         </w:rPr>
-        <w:t>Karabacek-</w:t>
-      </w:r>
-      <w:proofErr w:type="spellStart"/>
+        <w:t xml:space="preserve">Karabacek-Shahri Niloufar     </w:t>
+      </w:r>
       <w:r>
         <w:rPr>
           <w:rFonts w:ascii="Times New Roman" w:eastAsia="Times New Roman" w:hAnsi="Times New Roman"/>
@@ -276,9 +281,8 @@
           <w:sz w:val="32"/>
           <w:szCs w:val="32"/>
         </w:rPr>
-        <w:t>Shahri</w:t>
-      </w:r>
-      <w:proofErr w:type="spellEnd"/>
+        <w:t xml:space="preserve">      </w:t>
+      </w:r>
       <w:r>
         <w:rPr>
           <w:rFonts w:ascii="Times New Roman" w:eastAsia="Times New Roman" w:hAnsi="Times New Roman"/>
@@ -286,17 +290,20 @@
           <w:sz w:val="32"/>
           <w:szCs w:val="32"/>
         </w:rPr>
-        <w:t xml:space="preserve"> Niloufar     </w:t>
-      </w:r>
-      <w:r>
+        <w:t>if25b137@technikum-wien.at</w:t>
+      </w:r>
+    </w:p>
+    <w:p>
+      <w:pPr>
+        <w:pStyle w:val="Textbody"/>
+        <w:jc w:val="center"/>
         <w:rPr>
           <w:rFonts w:ascii="Times New Roman" w:eastAsia="Times New Roman" w:hAnsi="Times New Roman"/>
           <w:bCs/>
           <w:sz w:val="32"/>
           <w:szCs w:val="32"/>
         </w:rPr>
-        <w:t xml:space="preserve">      </w:t>
-      </w:r>
+      </w:pPr>
       <w:r>
         <w:rPr>
           <w:rFonts w:ascii="Times New Roman" w:eastAsia="Times New Roman" w:hAnsi="Times New Roman"/>
@@ -304,18 +311,18 @@
           <w:sz w:val="32"/>
           <w:szCs w:val="32"/>
         </w:rPr>
-        <w:t>if25b137@technikum-wien.at</w:t>
-      </w:r>
-    </w:p>
-    <w:p>
-      <w:pPr>
-        <w:pStyle w:val="Textbody"/>
-        <w:jc w:val="center"/>
+        <w:t>Karadeniz Alev                              if25b139@technikum-wien.at</w:t>
+      </w:r>
+    </w:p>
+    <w:p>
+      <w:pPr>
+        <w:pStyle w:val="Textbody"/>
         <w:rPr>
           <w:rFonts w:ascii="Times New Roman" w:eastAsia="Times New Roman" w:hAnsi="Times New Roman"/>
           <w:bCs/>
           <w:sz w:val="32"/>
           <w:szCs w:val="32"/>
+          <w:lang w:val="de-AT"/>
         </w:rPr>
       </w:pPr>
       <w:r>
@@ -325,28 +332,26 @@
           <w:sz w:val="32"/>
           <w:szCs w:val="32"/>
         </w:rPr>
-        <w:t>Karadeniz Alev                              if25b139@technikum-wien.at</w:t>
-      </w:r>
-    </w:p>
-    <w:p>
-      <w:pPr>
-        <w:pStyle w:val="Textbody"/>
+        <w:t xml:space="preserve">          </w:t>
+      </w:r>
+      <w:r>
         <w:rPr>
           <w:rFonts w:ascii="Times New Roman" w:eastAsia="Times New Roman" w:hAnsi="Times New Roman"/>
           <w:bCs/>
           <w:sz w:val="32"/>
           <w:szCs w:val="32"/>
-          <w:lang w:val="de-AT"/>
-        </w:rPr>
-      </w:pPr>
+        </w:rPr>
+        <w:t xml:space="preserve"> </w:t>
+      </w:r>
       <w:r>
         <w:rPr>
           <w:rFonts w:ascii="Times New Roman" w:eastAsia="Times New Roman" w:hAnsi="Times New Roman"/>
           <w:bCs/>
           <w:sz w:val="32"/>
           <w:szCs w:val="32"/>
-        </w:rPr>
-        <w:t xml:space="preserve">          </w:t>
+          <w:lang w:val="de-AT"/>
+        </w:rPr>
+        <w:t xml:space="preserve">Ermylos Schubart                       </w:t>
       </w:r>
       <w:r>
         <w:rPr>
@@ -354,10 +359,10 @@
           <w:bCs/>
           <w:sz w:val="32"/>
           <w:szCs w:val="32"/>
-        </w:rPr>
-        <w:t xml:space="preserve"> </w:t>
-      </w:r>
-      <w:proofErr w:type="spellStart"/>
+          <w:lang w:val="de-AT"/>
+        </w:rPr>
+        <w:t xml:space="preserve">   </w:t>
+      </w:r>
       <w:r>
         <w:rPr>
           <w:rFonts w:ascii="Times New Roman" w:eastAsia="Times New Roman" w:hAnsi="Times New Roman"/>
@@ -366,37 +371,6 @@
           <w:szCs w:val="32"/>
           <w:lang w:val="de-AT"/>
         </w:rPr>
-        <w:t>Ermylos</w:t>
-      </w:r>
-      <w:proofErr w:type="spellEnd"/>
-      <w:r>
-        <w:rPr>
-          <w:rFonts w:ascii="Times New Roman" w:eastAsia="Times New Roman" w:hAnsi="Times New Roman"/>
-          <w:bCs/>
-          <w:sz w:val="32"/>
-          <w:szCs w:val="32"/>
-          <w:lang w:val="de-AT"/>
-        </w:rPr>
-        <w:t xml:space="preserve"> Schubart                       </w:t>
-      </w:r>
-      <w:r>
-        <w:rPr>
-          <w:rFonts w:ascii="Times New Roman" w:eastAsia="Times New Roman" w:hAnsi="Times New Roman"/>
-          <w:bCs/>
-          <w:sz w:val="32"/>
-          <w:szCs w:val="32"/>
-          <w:lang w:val="de-AT"/>
-        </w:rPr>
-        <w:t xml:space="preserve">   </w:t>
-      </w:r>
-      <w:r>
-        <w:rPr>
-          <w:rFonts w:ascii="Times New Roman" w:eastAsia="Times New Roman" w:hAnsi="Times New Roman"/>
-          <w:bCs/>
-          <w:sz w:val="32"/>
-          <w:szCs w:val="32"/>
-          <w:lang w:val="de-AT"/>
-        </w:rPr>
         <w:t>if25b154@technikum-wien.at</w:t>
       </w:r>
     </w:p>
@@ -461,15 +435,7 @@
           <w:rFonts w:ascii="Times New Roman" w:eastAsia="Times New Roman" w:hAnsi="Times New Roman"/>
           <w:lang w:val="de-AT"/>
         </w:rPr>
-        <w:t xml:space="preserve">Der Spieler schlüpft in die Rolle </w:t>
-      </w:r>
-      <w:proofErr w:type="gramStart"/>
-      <w:r>
-        <w:rPr>
-          <w:rFonts w:ascii="Times New Roman" w:eastAsia="Times New Roman" w:hAnsi="Times New Roman"/>
-          <w:lang w:val="de-AT"/>
-        </w:rPr>
-        <w:t>eines einsamen Held</w:t>
+        <w:t>Der Spieler schlüpft in die Rolle eines einsamen Held</w:t>
       </w:r>
       <w:r>
         <w:rPr>
@@ -478,7 +444,6 @@
         </w:rPr>
         <w:t>in</w:t>
       </w:r>
-      <w:proofErr w:type="gramEnd"/>
       <w:r>
         <w:rPr>
           <w:rFonts w:ascii="Times New Roman" w:eastAsia="Times New Roman" w:hAnsi="Times New Roman"/>
@@ -713,59 +678,22 @@
           <w:sz w:val="32"/>
           <w:szCs w:val="32"/>
         </w:rPr>
-        <w:t xml:space="preserve">2. </w:t>
-      </w:r>
-      <w:proofErr w:type="spellStart"/>
-      <w:r>
-        <w:rPr>
-          <w:rFonts w:ascii="Times New Roman" w:eastAsia="Times New Roman" w:hAnsi="Times New Roman"/>
-          <w:sz w:val="32"/>
-          <w:szCs w:val="32"/>
-        </w:rPr>
-        <w:t>Systemanforderungen</w:t>
-      </w:r>
-      <w:proofErr w:type="spellEnd"/>
-      <w:r>
-        <w:rPr>
-          <w:rFonts w:ascii="Times New Roman" w:eastAsia="Times New Roman" w:hAnsi="Times New Roman"/>
-          <w:sz w:val="32"/>
-          <w:szCs w:val="32"/>
-        </w:rPr>
-        <w:t xml:space="preserve"> und </w:t>
-      </w:r>
-      <w:proofErr w:type="spellStart"/>
-      <w:r>
-        <w:rPr>
-          <w:rFonts w:ascii="Times New Roman" w:eastAsia="Times New Roman" w:hAnsi="Times New Roman"/>
-          <w:sz w:val="32"/>
-          <w:szCs w:val="32"/>
-        </w:rPr>
-        <w:t>Ausführung</w:t>
-      </w:r>
-      <w:proofErr w:type="spellEnd"/>
-    </w:p>
-    <w:p>
-      <w:pPr>
-        <w:pStyle w:val="Textbody"/>
-        <w:rPr>
-          <w:rFonts w:ascii="Times New Roman" w:eastAsia="Times New Roman" w:hAnsi="Times New Roman"/>
-        </w:rPr>
-      </w:pPr>
-      <w:proofErr w:type="spellStart"/>
+        <w:t>2. Systemanforderungen und Ausführung</w:t>
+      </w:r>
+    </w:p>
+    <w:p>
+      <w:pPr>
+        <w:pStyle w:val="Textbody"/>
+        <w:rPr>
+          <w:rFonts w:ascii="Times New Roman" w:eastAsia="Times New Roman" w:hAnsi="Times New Roman"/>
+        </w:rPr>
+      </w:pPr>
       <w:r>
         <w:rPr>
           <w:rFonts w:ascii="Times New Roman" w:eastAsia="Times New Roman" w:hAnsi="Times New Roman"/>
           <w:b/>
         </w:rPr>
-        <w:t>Anforderungen</w:t>
-      </w:r>
-      <w:proofErr w:type="spellEnd"/>
-      <w:r>
-        <w:rPr>
-          <w:rFonts w:ascii="Times New Roman" w:eastAsia="Times New Roman" w:hAnsi="Times New Roman"/>
-          <w:b/>
-        </w:rPr>
-        <w:t>:</w:t>
+        <w:t>Anforderungen:</w:t>
       </w:r>
     </w:p>
     <w:p>
@@ -779,21 +707,12 @@
           <w:rFonts w:ascii="Times New Roman" w:eastAsia="Times New Roman" w:hAnsi="Times New Roman"/>
         </w:rPr>
       </w:pPr>
-      <w:proofErr w:type="spellStart"/>
       <w:r>
         <w:rPr>
           <w:rFonts w:ascii="Times New Roman" w:eastAsia="Times New Roman" w:hAnsi="Times New Roman"/>
           <w:b/>
         </w:rPr>
-        <w:t>Betriebssystem</w:t>
-      </w:r>
-      <w:proofErr w:type="spellEnd"/>
-      <w:r>
-        <w:rPr>
-          <w:rFonts w:ascii="Times New Roman" w:eastAsia="Times New Roman" w:hAnsi="Times New Roman"/>
-          <w:b/>
-        </w:rPr>
-        <w:t>:</w:t>
+        <w:t>Betriebssystem:</w:t>
       </w:r>
       <w:r>
         <w:rPr>
@@ -827,23 +746,7 @@
           <w:rFonts w:ascii="Times New Roman" w:eastAsia="Times New Roman" w:hAnsi="Times New Roman"/>
           <w:lang w:val="de-AT"/>
         </w:rPr>
-        <w:t xml:space="preserve"> Keine spezielle Grafikkarte nötig (Textbasiert mit </w:t>
-      </w:r>
-      <w:proofErr w:type="spellStart"/>
-      <w:r>
-        <w:rPr>
-          <w:rFonts w:ascii="Times New Roman" w:eastAsia="Times New Roman" w:hAnsi="Times New Roman"/>
-          <w:lang w:val="de-AT"/>
-        </w:rPr>
-        <w:t>PDCurses</w:t>
-      </w:r>
-      <w:proofErr w:type="spellEnd"/>
-      <w:r>
-        <w:rPr>
-          <w:rFonts w:ascii="Times New Roman" w:eastAsia="Times New Roman" w:hAnsi="Times New Roman"/>
-          <w:lang w:val="de-AT"/>
-        </w:rPr>
-        <w:t>).</w:t>
+        <w:t xml:space="preserve"> Keine spezielle Grafikkarte nötig (Textbasiert mit PDCurses).</w:t>
       </w:r>
     </w:p>
     <w:p>
@@ -861,59 +764,22 @@
           <w:sz w:val="32"/>
           <w:szCs w:val="32"/>
         </w:rPr>
-        <w:t xml:space="preserve">3. </w:t>
-      </w:r>
-      <w:proofErr w:type="spellStart"/>
-      <w:r>
-        <w:rPr>
-          <w:rFonts w:ascii="Times New Roman" w:eastAsia="Times New Roman" w:hAnsi="Times New Roman"/>
-          <w:sz w:val="32"/>
-          <w:szCs w:val="32"/>
-        </w:rPr>
-        <w:t>Steuerung</w:t>
-      </w:r>
-      <w:proofErr w:type="spellEnd"/>
-      <w:r>
-        <w:rPr>
-          <w:rFonts w:ascii="Times New Roman" w:eastAsia="Times New Roman" w:hAnsi="Times New Roman"/>
-          <w:sz w:val="32"/>
-          <w:szCs w:val="32"/>
-        </w:rPr>
-        <w:t xml:space="preserve"> und </w:t>
-      </w:r>
-      <w:proofErr w:type="spellStart"/>
-      <w:r>
-        <w:rPr>
-          <w:rFonts w:ascii="Times New Roman" w:eastAsia="Times New Roman" w:hAnsi="Times New Roman"/>
-          <w:sz w:val="32"/>
-          <w:szCs w:val="32"/>
-        </w:rPr>
-        <w:t>Benutzeroberfläche</w:t>
-      </w:r>
-      <w:proofErr w:type="spellEnd"/>
-    </w:p>
-    <w:p>
-      <w:pPr>
-        <w:pStyle w:val="Textbody"/>
-        <w:rPr>
-          <w:rFonts w:ascii="Times New Roman" w:eastAsia="Times New Roman" w:hAnsi="Times New Roman"/>
-        </w:rPr>
-      </w:pPr>
-      <w:proofErr w:type="spellStart"/>
+        <w:t>3. Steuerung und Benutzeroberfläche</w:t>
+      </w:r>
+    </w:p>
+    <w:p>
+      <w:pPr>
+        <w:pStyle w:val="Textbody"/>
+        <w:rPr>
+          <w:rFonts w:ascii="Times New Roman" w:eastAsia="Times New Roman" w:hAnsi="Times New Roman"/>
+        </w:rPr>
+      </w:pPr>
       <w:r>
         <w:rPr>
           <w:rFonts w:ascii="Times New Roman" w:eastAsia="Times New Roman" w:hAnsi="Times New Roman"/>
           <w:b/>
         </w:rPr>
-        <w:t>Tastatursteuerung</w:t>
-      </w:r>
-      <w:proofErr w:type="spellEnd"/>
-      <w:r>
-        <w:rPr>
-          <w:rFonts w:ascii="Times New Roman" w:eastAsia="Times New Roman" w:hAnsi="Times New Roman"/>
-          <w:b/>
-        </w:rPr>
-        <w:t>:</w:t>
+        <w:t>Tastatursteuerung:</w:t>
       </w:r>
     </w:p>
     <w:p>
@@ -941,23 +807,7 @@
           <w:rFonts w:ascii="Times New Roman" w:eastAsia="Times New Roman" w:hAnsi="Times New Roman"/>
           <w:lang w:val="de-AT"/>
         </w:rPr>
-        <w:t xml:space="preserve"> Bewegen (Oben, Links, Unten, </w:t>
-      </w:r>
-      <w:proofErr w:type="spellStart"/>
-      <w:r>
-        <w:rPr>
-          <w:rFonts w:ascii="Times New Roman" w:eastAsia="Times New Roman" w:hAnsi="Times New Roman"/>
-          <w:lang w:val="de-AT"/>
-        </w:rPr>
-        <w:t>Rechts</w:t>
-      </w:r>
-      <w:proofErr w:type="spellEnd"/>
-      <w:r>
-        <w:rPr>
-          <w:rFonts w:ascii="Times New Roman" w:eastAsia="Times New Roman" w:hAnsi="Times New Roman"/>
-          <w:lang w:val="de-AT"/>
-        </w:rPr>
-        <w:t>).</w:t>
+        <w:t xml:space="preserve"> Bewegen (Oben, Links, Unten, Rechts).</w:t>
       </w:r>
     </w:p>
     <w:p>
@@ -1027,23 +877,7 @@
           <w:rFonts w:ascii="Times New Roman" w:eastAsia="Times New Roman" w:hAnsi="Times New Roman"/>
           <w:lang w:val="de-AT"/>
         </w:rPr>
-        <w:t xml:space="preserve">Blendet System-Informationen (FPS und </w:t>
-      </w:r>
-      <w:proofErr w:type="spellStart"/>
-      <w:r>
-        <w:rPr>
-          <w:rFonts w:ascii="Times New Roman" w:eastAsia="Times New Roman" w:hAnsi="Times New Roman"/>
-          <w:lang w:val="de-AT"/>
-        </w:rPr>
-        <w:t>DeltaTime</w:t>
-      </w:r>
-      <w:proofErr w:type="spellEnd"/>
-      <w:r>
-        <w:rPr>
-          <w:rFonts w:ascii="Times New Roman" w:eastAsia="Times New Roman" w:hAnsi="Times New Roman"/>
-          <w:lang w:val="de-AT"/>
-        </w:rPr>
-        <w:t xml:space="preserve">) ein oder aus. </w:t>
+        <w:t xml:space="preserve">Blendet System-Informationen (FPS und DeltaTime) ein oder aus. </w:t>
       </w:r>
     </w:p>
     <w:p>
@@ -1099,23 +933,7 @@
           <w:rFonts w:ascii="Times New Roman" w:eastAsia="Times New Roman" w:hAnsi="Times New Roman" w:hint="eastAsia"/>
           <w:lang w:val="de-AT"/>
         </w:rPr>
-        <w:t xml:space="preserve"> Zeigt die </w:t>
-      </w:r>
-      <w:proofErr w:type="spellStart"/>
-      <w:r>
-        <w:rPr>
-          <w:rFonts w:ascii="Times New Roman" w:eastAsia="Times New Roman" w:hAnsi="Times New Roman" w:hint="eastAsia"/>
-          <w:lang w:val="de-AT"/>
-        </w:rPr>
-        <w:t>Bounding</w:t>
-      </w:r>
-      <w:proofErr w:type="spellEnd"/>
-      <w:r>
-        <w:rPr>
-          <w:rFonts w:ascii="Times New Roman" w:eastAsia="Times New Roman" w:hAnsi="Times New Roman" w:hint="eastAsia"/>
-          <w:lang w:val="de-AT"/>
-        </w:rPr>
-        <w:t xml:space="preserve"> Boxes (Kollisionsrahmen) an.</w:t>
+        <w:t xml:space="preserve"> Zeigt die Bounding Boxes (Kollisionsrahmen) an.</w:t>
       </w:r>
     </w:p>
     <w:p>
@@ -1189,7 +1007,6 @@
           <w:rFonts w:ascii="Times New Roman" w:eastAsia="Times New Roman" w:hAnsi="Times New Roman"/>
         </w:rPr>
       </w:pPr>
-      <w:proofErr w:type="spellStart"/>
       <w:r>
         <w:rPr>
           <w:rFonts w:ascii="Times New Roman" w:eastAsia="Times New Roman" w:hAnsi="Times New Roman"/>
@@ -1197,7 +1014,6 @@
         </w:rPr>
         <w:t>Benutzeroberfläche</w:t>
       </w:r>
-      <w:proofErr w:type="spellEnd"/>
     </w:p>
     <w:p>
       <w:pPr>
@@ -1231,23 +1047,7 @@
           <w:rFonts w:ascii="Times New Roman" w:eastAsia="Times New Roman" w:hAnsi="Times New Roman"/>
           <w:lang w:val="de-AT"/>
         </w:rPr>
-        <w:t>Hier sind immer die aktuellen Werte sichtbar: Leben (Health), Angriff (</w:t>
-      </w:r>
-      <w:proofErr w:type="spellStart"/>
-      <w:r>
-        <w:rPr>
-          <w:rFonts w:ascii="Times New Roman" w:eastAsia="Times New Roman" w:hAnsi="Times New Roman"/>
-          <w:lang w:val="de-AT"/>
-        </w:rPr>
-        <w:t>Attack</w:t>
-      </w:r>
-      <w:proofErr w:type="spellEnd"/>
-      <w:r>
-        <w:rPr>
-          <w:rFonts w:ascii="Times New Roman" w:eastAsia="Times New Roman" w:hAnsi="Times New Roman"/>
-          <w:lang w:val="de-AT"/>
-        </w:rPr>
-        <w:t xml:space="preserve">), Verteidigung (Defence), Geschwindigkeit (Speed) und die aktuelle Raum-Position im 3x3 Gitter (z.B. Raum [1,2]). </w:t>
+        <w:t xml:space="preserve">Hier sind immer die aktuellen Werte sichtbar: Leben (Health), Angriff (Attack), Verteidigung (Defence), Geschwindigkeit (Speed) und die aktuelle Raum-Position im 3x3 Gitter (z.B. Raum [1,2]). </w:t>
       </w:r>
     </w:p>
     <w:p>
@@ -1734,21 +1534,12 @@
           <w:lang w:val="de-AT"/>
         </w:rPr>
       </w:pPr>
-      <w:proofErr w:type="spellStart"/>
-      <w:r>
-        <w:rPr>
-          <w:rFonts w:ascii="Times New Roman" w:eastAsia="Times New Roman" w:hAnsi="Times New Roman"/>
-          <w:lang w:val="de-AT"/>
-        </w:rPr>
-        <w:t>Debuff</w:t>
-      </w:r>
-      <w:proofErr w:type="spellEnd"/>
-      <w:r>
-        <w:rPr>
-          <w:rFonts w:ascii="Times New Roman" w:eastAsia="Times New Roman" w:hAnsi="Times New Roman"/>
-          <w:lang w:val="de-AT"/>
-        </w:rPr>
-        <w:t xml:space="preserve"> (Schwächung): Senkt vorübergehend einen Wert des Gegners.</w:t>
+      <w:r>
+        <w:rPr>
+          <w:rFonts w:ascii="Times New Roman" w:eastAsia="Times New Roman" w:hAnsi="Times New Roman"/>
+          <w:lang w:val="de-AT"/>
+        </w:rPr>
+        <w:t>Debuff (Schwächung): Senkt vorübergehend einen Wert des Gegners.</w:t>
       </w:r>
     </w:p>
     <w:p>
@@ -1775,23 +1566,7 @@
           <w:rFonts w:ascii="Times New Roman" w:eastAsia="Times New Roman" w:hAnsi="Times New Roman"/>
           <w:lang w:val="de-AT"/>
         </w:rPr>
-        <w:t xml:space="preserve"> (</w:t>
-      </w:r>
-      <w:proofErr w:type="spellStart"/>
-      <w:r>
-        <w:rPr>
-          <w:rFonts w:ascii="Times New Roman" w:eastAsia="Times New Roman" w:hAnsi="Times New Roman"/>
-          <w:lang w:val="de-AT"/>
-        </w:rPr>
-        <w:t>space</w:t>
-      </w:r>
-      <w:proofErr w:type="spellEnd"/>
-      <w:r>
-        <w:rPr>
-          <w:rFonts w:ascii="Times New Roman" w:eastAsia="Times New Roman" w:hAnsi="Times New Roman"/>
-          <w:lang w:val="de-AT"/>
-        </w:rPr>
-        <w:t>)</w:t>
+        <w:t xml:space="preserve"> (space)</w:t>
       </w:r>
       <w:r>
         <w:rPr>
@@ -1863,7 +1638,6 @@
           <w:lang w:val="de-AT"/>
         </w:rPr>
       </w:pPr>
-      <w:proofErr w:type="spellStart"/>
       <w:r>
         <w:rPr>
           <w:rFonts w:ascii="Times New Roman" w:eastAsia="Times New Roman" w:hAnsi="Times New Roman"/>
@@ -1871,7 +1645,6 @@
         </w:rPr>
         <w:t>Attack</w:t>
       </w:r>
-      <w:proofErr w:type="spellEnd"/>
       <w:r>
         <w:rPr>
           <w:rFonts w:ascii="Times New Roman" w:eastAsia="Times New Roman" w:hAnsi="Times New Roman"/>
@@ -1973,37 +1746,12 @@
           <w:rFonts w:ascii="Times New Roman" w:eastAsia="Times New Roman" w:hAnsi="Times New Roman"/>
         </w:rPr>
       </w:pPr>
-      <w:proofErr w:type="spellStart"/>
       <w:r>
         <w:rPr>
           <w:rFonts w:ascii="Times New Roman" w:eastAsia="Times New Roman" w:hAnsi="Times New Roman"/>
           <w:b/>
         </w:rPr>
-        <w:t>Gewinnen</w:t>
-      </w:r>
-      <w:proofErr w:type="spellEnd"/>
-      <w:r>
-        <w:rPr>
-          <w:rFonts w:ascii="Times New Roman" w:eastAsia="Times New Roman" w:hAnsi="Times New Roman"/>
-          <w:b/>
-        </w:rPr>
-        <w:t xml:space="preserve"> und </w:t>
-      </w:r>
-      <w:proofErr w:type="spellStart"/>
-      <w:r>
-        <w:rPr>
-          <w:rFonts w:ascii="Times New Roman" w:eastAsia="Times New Roman" w:hAnsi="Times New Roman"/>
-          <w:b/>
-        </w:rPr>
-        <w:t>Verlieren</w:t>
-      </w:r>
-      <w:proofErr w:type="spellEnd"/>
-      <w:r>
-        <w:rPr>
-          <w:rFonts w:ascii="Times New Roman" w:eastAsia="Times New Roman" w:hAnsi="Times New Roman"/>
-          <w:b/>
-        </w:rPr>
-        <w:t>:</w:t>
+        <w:t>Gewinnen und Verlieren:</w:t>
       </w:r>
     </w:p>
     <w:p>
@@ -2071,14 +1819,7 @@
         <w:rPr>
           <w:lang w:val="de-AT"/>
         </w:rPr>
-        <w:t xml:space="preserve">Wenn genug Relikte gesammelt wurden und der Gatekeeper erreicht wird. Das Spiel stoppt und zeigt </w:t>
-      </w:r>
-      <w:proofErr w:type="gramStart"/>
-      <w:r>
-        <w:rPr>
-          <w:lang w:val="de-AT"/>
-        </w:rPr>
-        <w:t xml:space="preserve">eine </w:t>
+        <w:t xml:space="preserve">Wenn genug Relikte gesammelt wurden und der Gatekeeper erreicht wird. Das Spiel stoppt und zeigt eine </w:t>
       </w:r>
       <w:r>
         <w:rPr>
@@ -2086,7 +1827,6 @@
         </w:rPr>
         <w:t>Counter</w:t>
       </w:r>
-      <w:proofErr w:type="gramEnd"/>
       <w:r>
         <w:rPr>
           <w:lang w:val="de-AT"/>
@@ -2255,55 +1995,7 @@
           <w:rFonts w:ascii="Times New Roman" w:eastAsia="Times New Roman" w:hAnsi="Times New Roman"/>
           <w:b/>
         </w:rPr>
-        <w:t>FAQ (</w:t>
-      </w:r>
-      <w:proofErr w:type="spellStart"/>
-      <w:r>
-        <w:rPr>
-          <w:rFonts w:ascii="Times New Roman" w:eastAsia="Times New Roman" w:hAnsi="Times New Roman"/>
-          <w:b/>
-        </w:rPr>
-        <w:t>Häufig</w:t>
-      </w:r>
-      <w:proofErr w:type="spellEnd"/>
-      <w:r>
-        <w:rPr>
-          <w:rFonts w:ascii="Times New Roman" w:eastAsia="Times New Roman" w:hAnsi="Times New Roman"/>
-          <w:b/>
-        </w:rPr>
-        <w:t xml:space="preserve"> </w:t>
-      </w:r>
-      <w:proofErr w:type="spellStart"/>
-      <w:r>
-        <w:rPr>
-          <w:rFonts w:ascii="Times New Roman" w:eastAsia="Times New Roman" w:hAnsi="Times New Roman"/>
-          <w:b/>
-        </w:rPr>
-        <w:t>gestellte</w:t>
-      </w:r>
-      <w:proofErr w:type="spellEnd"/>
-      <w:r>
-        <w:rPr>
-          <w:rFonts w:ascii="Times New Roman" w:eastAsia="Times New Roman" w:hAnsi="Times New Roman"/>
-          <w:b/>
-        </w:rPr>
-        <w:t xml:space="preserve"> </w:t>
-      </w:r>
-      <w:proofErr w:type="spellStart"/>
-      <w:r>
-        <w:rPr>
-          <w:rFonts w:ascii="Times New Roman" w:eastAsia="Times New Roman" w:hAnsi="Times New Roman"/>
-          <w:b/>
-        </w:rPr>
-        <w:t>Fragen</w:t>
-      </w:r>
-      <w:proofErr w:type="spellEnd"/>
-      <w:r>
-        <w:rPr>
-          <w:rFonts w:ascii="Times New Roman" w:eastAsia="Times New Roman" w:hAnsi="Times New Roman"/>
-          <w:b/>
-        </w:rPr>
-        <w:t>):</w:t>
+        <w:t>FAQ (Häufig gestellte Fragen):</w:t>
       </w:r>
     </w:p>
     <w:p>
@@ -2385,35 +2077,7 @@
         <w:rPr>
           <w:rFonts w:ascii="Times New Roman" w:eastAsia="Times New Roman" w:hAnsi="Times New Roman"/>
         </w:rPr>
-        <w:t xml:space="preserve"> </w:t>
-      </w:r>
-      <w:proofErr w:type="gramStart"/>
-      <w:r>
-        <w:rPr>
-          <w:rFonts w:ascii="Times New Roman" w:eastAsia="Times New Roman" w:hAnsi="Times New Roman"/>
-        </w:rPr>
-        <w:t>Team  4</w:t>
-      </w:r>
-      <w:proofErr w:type="gramEnd"/>
-      <w:r>
-        <w:rPr>
-          <w:rFonts w:ascii="Times New Roman" w:eastAsia="Times New Roman" w:hAnsi="Times New Roman"/>
-        </w:rPr>
-        <w:t xml:space="preserve"> (</w:t>
-      </w:r>
-      <w:proofErr w:type="spellStart"/>
-      <w:r>
-        <w:rPr>
-          <w:rFonts w:ascii="Times New Roman" w:eastAsia="Times New Roman" w:hAnsi="Times New Roman"/>
-        </w:rPr>
-        <w:t>Hochschulprojekt</w:t>
-      </w:r>
-      <w:proofErr w:type="spellEnd"/>
-      <w:r>
-        <w:rPr>
-          <w:rFonts w:ascii="Times New Roman" w:eastAsia="Times New Roman" w:hAnsi="Times New Roman"/>
-        </w:rPr>
-        <w:t>)</w:t>
+        <w:t xml:space="preserve"> Team  4 (Hochschulprojekt)</w:t>
       </w:r>
     </w:p>
     <w:p>

</xml_diff>